<commit_message>
annex plots and tables
</commit_message>
<xml_diff>
--- a/assessment/risk_tables/FinMod.h2_output.docx
+++ b/assessment/risk_tables/FinMod.h2_output.docx
@@ -585,7 +585,7 @@
               <w:jc w:val="center"/>
             </w:pPr>
             <w:r>
-              <w:t xml:space="preserve">0.5</w:t>
+              <w:t xml:space="preserve">FMSY</w:t>
             </w:r>
           </w:p>
         </w:tc>
@@ -649,7 +649,7 @@
               <w:jc w:val="center"/>
             </w:pPr>
             <w:r>
-              <w:t xml:space="preserve">100</w:t>
+              <w:t xml:space="preserve">98</w:t>
             </w:r>
           </w:p>
         </w:tc>
@@ -681,7 +681,7 @@
               <w:jc w:val="center"/>
             </w:pPr>
             <w:r>
-              <w:t xml:space="preserve">100</w:t>
+              <w:t xml:space="preserve">87</w:t>
             </w:r>
           </w:p>
         </w:tc>
@@ -827,7 +827,7 @@
               <w:jc w:val="center"/>
             </w:pPr>
             <w:r>
-              <w:t xml:space="preserve">100</w:t>
+              <w:t xml:space="preserve">99</w:t>
             </w:r>
           </w:p>
         </w:tc>
@@ -941,7 +941,7 @@
               <w:jc w:val="center"/>
             </w:pPr>
             <w:r>
-              <w:t xml:space="preserve">100</w:t>
+              <w:t xml:space="preserve">99</w:t>
             </w:r>
           </w:p>
         </w:tc>
@@ -973,7 +973,7 @@
               <w:jc w:val="center"/>
             </w:pPr>
             <w:r>
-              <w:t xml:space="preserve">100</w:t>
+              <w:t xml:space="preserve">96</w:t>
             </w:r>
           </w:p>
         </w:tc>
@@ -1087,7 +1087,7 @@
               <w:jc w:val="center"/>
             </w:pPr>
             <w:r>
-              <w:t xml:space="preserve">100</w:t>
+              <w:t xml:space="preserve">98</w:t>
             </w:r>
           </w:p>
         </w:tc>
@@ -1119,7 +1119,7 @@
               <w:jc w:val="center"/>
             </w:pPr>
             <w:r>
-              <w:t xml:space="preserve">100</w:t>
+              <w:t xml:space="preserve">92</w:t>
             </w:r>
           </w:p>
         </w:tc>
@@ -1574,71 +1574,71 @@
               <w:jc w:val="center"/>
             </w:pPr>
             <w:r>
+              <w:t xml:space="preserve">100</w:t>
+            </w:r>
+          </w:p>
+        </w:tc>
+        <w:tc>
+          <w:tcPr/>
+          <w:p>
+            <w:pPr>
+              <w:numPr>
+                <w:ilvl w:val="0"/>
+                <w:numId w:val="1000"/>
+              </w:numPr>
+              <w:pStyle w:val="Compact"/>
+              <w:jc w:val="center"/>
+            </w:pPr>
+            <w:r>
+              <w:t xml:space="preserve">2746</w:t>
+            </w:r>
+          </w:p>
+        </w:tc>
+        <w:tc>
+          <w:tcPr/>
+          <w:p>
+            <w:pPr>
+              <w:numPr>
+                <w:ilvl w:val="0"/>
+                <w:numId w:val="1000"/>
+              </w:numPr>
+              <w:pStyle w:val="Compact"/>
+              <w:jc w:val="center"/>
+            </w:pPr>
+            <w:r>
+              <w:t xml:space="preserve">100</w:t>
+            </w:r>
+          </w:p>
+        </w:tc>
+        <w:tc>
+          <w:tcPr/>
+          <w:p>
+            <w:pPr>
+              <w:numPr>
+                <w:ilvl w:val="0"/>
+                <w:numId w:val="1000"/>
+              </w:numPr>
+              <w:pStyle w:val="Compact"/>
+              <w:jc w:val="center"/>
+            </w:pPr>
+            <w:r>
+              <w:t xml:space="preserve">2371</w:t>
+            </w:r>
+          </w:p>
+        </w:tc>
+        <w:tc>
+          <w:tcPr/>
+          <w:p>
+            <w:pPr>
+              <w:numPr>
+                <w:ilvl w:val="0"/>
+                <w:numId w:val="1000"/>
+              </w:numPr>
+              <w:pStyle w:val="Compact"/>
+              <w:jc w:val="center"/>
+            </w:pPr>
+            <w:r>
               <w:t xml:space="preserve">99</w:t>
-            </w:r>
-          </w:p>
-        </w:tc>
-        <w:tc>
-          <w:tcPr/>
-          <w:p>
-            <w:pPr>
-              <w:numPr>
-                <w:ilvl w:val="0"/>
-                <w:numId w:val="1000"/>
-              </w:numPr>
-              <w:pStyle w:val="Compact"/>
-              <w:jc w:val="center"/>
-            </w:pPr>
-            <w:r>
-              <w:t xml:space="preserve">2746</w:t>
-            </w:r>
-          </w:p>
-        </w:tc>
-        <w:tc>
-          <w:tcPr/>
-          <w:p>
-            <w:pPr>
-              <w:numPr>
-                <w:ilvl w:val="0"/>
-                <w:numId w:val="1000"/>
-              </w:numPr>
-              <w:pStyle w:val="Compact"/>
-              <w:jc w:val="center"/>
-            </w:pPr>
-            <w:r>
-              <w:t xml:space="preserve">98</w:t>
-            </w:r>
-          </w:p>
-        </w:tc>
-        <w:tc>
-          <w:tcPr/>
-          <w:p>
-            <w:pPr>
-              <w:numPr>
-                <w:ilvl w:val="0"/>
-                <w:numId w:val="1000"/>
-              </w:numPr>
-              <w:pStyle w:val="Compact"/>
-              <w:jc w:val="center"/>
-            </w:pPr>
-            <w:r>
-              <w:t xml:space="preserve">2371</w:t>
-            </w:r>
-          </w:p>
-        </w:tc>
-        <w:tc>
-          <w:tcPr/>
-          <w:p>
-            <w:pPr>
-              <w:numPr>
-                <w:ilvl w:val="0"/>
-                <w:numId w:val="1000"/>
-              </w:numPr>
-              <w:pStyle w:val="Compact"/>
-              <w:jc w:val="center"/>
-            </w:pPr>
-            <w:r>
-              <w:t xml:space="preserve">91</w:t>
             </w:r>
           </w:p>
         </w:tc>
@@ -1688,7 +1688,7 @@
               <w:jc w:val="center"/>
             </w:pPr>
             <w:r>
-              <w:t xml:space="preserve">0.5</w:t>
+              <w:t xml:space="preserve">FMSY</w:t>
             </w:r>
           </w:p>
         </w:tc>
@@ -1720,7 +1720,7 @@
               <w:jc w:val="center"/>
             </w:pPr>
             <w:r>
-              <w:t xml:space="preserve">98</w:t>
+              <w:t xml:space="preserve">100</w:t>
             </w:r>
           </w:p>
         </w:tc>
@@ -1752,7 +1752,7 @@
               <w:jc w:val="center"/>
             </w:pPr>
             <w:r>
-              <w:t xml:space="preserve">69</w:t>
+              <w:t xml:space="preserve">96</w:t>
             </w:r>
           </w:p>
         </w:tc>
@@ -1784,7 +1784,7 @@
               <w:jc w:val="center"/>
             </w:pPr>
             <w:r>
-              <w:t xml:space="preserve">2</w:t>
+              <w:t xml:space="preserve">43</w:t>
             </w:r>
           </w:p>
         </w:tc>
@@ -1866,6 +1866,38 @@
               <w:jc w:val="center"/>
             </w:pPr>
             <w:r>
+              <w:t xml:space="preserve">100</w:t>
+            </w:r>
+          </w:p>
+        </w:tc>
+        <w:tc>
+          <w:tcPr/>
+          <w:p>
+            <w:pPr>
+              <w:numPr>
+                <w:ilvl w:val="0"/>
+                <w:numId w:val="1000"/>
+              </w:numPr>
+              <w:pStyle w:val="Compact"/>
+              <w:jc w:val="center"/>
+            </w:pPr>
+            <w:r>
+              <w:t xml:space="preserve">2441</w:t>
+            </w:r>
+          </w:p>
+        </w:tc>
+        <w:tc>
+          <w:tcPr/>
+          <w:p>
+            <w:pPr>
+              <w:numPr>
+                <w:ilvl w:val="0"/>
+                <w:numId w:val="1000"/>
+              </w:numPr>
+              <w:pStyle w:val="Compact"/>
+              <w:jc w:val="center"/>
+            </w:pPr>
+            <w:r>
               <w:t xml:space="preserve">99</w:t>
             </w:r>
           </w:p>
@@ -1882,38 +1914,6 @@
               <w:jc w:val="center"/>
             </w:pPr>
             <w:r>
-              <w:t xml:space="preserve">2441</w:t>
-            </w:r>
-          </w:p>
-        </w:tc>
-        <w:tc>
-          <w:tcPr/>
-          <w:p>
-            <w:pPr>
-              <w:numPr>
-                <w:ilvl w:val="0"/>
-                <w:numId w:val="1000"/>
-              </w:numPr>
-              <w:pStyle w:val="Compact"/>
-              <w:jc w:val="center"/>
-            </w:pPr>
-            <w:r>
-              <w:t xml:space="preserve">94</w:t>
-            </w:r>
-          </w:p>
-        </w:tc>
-        <w:tc>
-          <w:tcPr/>
-          <w:p>
-            <w:pPr>
-              <w:numPr>
-                <w:ilvl w:val="0"/>
-                <w:numId w:val="1000"/>
-              </w:numPr>
-              <w:pStyle w:val="Compact"/>
-              <w:jc w:val="center"/>
-            </w:pPr>
-            <w:r>
               <w:t xml:space="preserve">1949</w:t>
             </w:r>
           </w:p>
@@ -1930,7 +1930,7 @@
               <w:jc w:val="center"/>
             </w:pPr>
             <w:r>
-              <w:t xml:space="preserve">76</w:t>
+              <w:t xml:space="preserve">95</w:t>
             </w:r>
           </w:p>
         </w:tc>
@@ -2012,7 +2012,7 @@
               <w:jc w:val="center"/>
             </w:pPr>
             <w:r>
-              <w:t xml:space="preserve">98</w:t>
+              <w:t xml:space="preserve">100</w:t>
             </w:r>
           </w:p>
         </w:tc>
@@ -2044,7 +2044,7 @@
               <w:jc w:val="center"/>
             </w:pPr>
             <w:r>
-              <w:t xml:space="preserve">92</w:t>
+              <w:t xml:space="preserve">99</w:t>
             </w:r>
           </w:p>
         </w:tc>
@@ -2076,7 +2076,7 @@
               <w:jc w:val="center"/>
             </w:pPr>
             <w:r>
-              <w:t xml:space="preserve">68</w:t>
+              <w:t xml:space="preserve">93</w:t>
             </w:r>
           </w:p>
         </w:tc>
@@ -2158,7 +2158,7 @@
               <w:jc w:val="center"/>
             </w:pPr>
             <w:r>
-              <w:t xml:space="preserve">98</w:t>
+              <w:t xml:space="preserve">100</w:t>
             </w:r>
           </w:p>
         </w:tc>
@@ -2190,39 +2190,39 @@
               <w:jc w:val="center"/>
             </w:pPr>
             <w:r>
+              <w:t xml:space="preserve">99</w:t>
+            </w:r>
+          </w:p>
+        </w:tc>
+        <w:tc>
+          <w:tcPr/>
+          <w:p>
+            <w:pPr>
+              <w:numPr>
+                <w:ilvl w:val="0"/>
+                <w:numId w:val="1000"/>
+              </w:numPr>
+              <w:pStyle w:val="Compact"/>
+              <w:jc w:val="center"/>
+            </w:pPr>
+            <w:r>
+              <w:t xml:space="preserve">1719</w:t>
+            </w:r>
+          </w:p>
+        </w:tc>
+        <w:tc>
+          <w:tcPr/>
+          <w:p>
+            <w:pPr>
+              <w:numPr>
+                <w:ilvl w:val="0"/>
+                <w:numId w:val="1000"/>
+              </w:numPr>
+              <w:pStyle w:val="Compact"/>
+              <w:jc w:val="center"/>
+            </w:pPr>
+            <w:r>
               <w:t xml:space="preserve">90</w:t>
-            </w:r>
-          </w:p>
-        </w:tc>
-        <w:tc>
-          <w:tcPr/>
-          <w:p>
-            <w:pPr>
-              <w:numPr>
-                <w:ilvl w:val="0"/>
-                <w:numId w:val="1000"/>
-              </w:numPr>
-              <w:pStyle w:val="Compact"/>
-              <w:jc w:val="center"/>
-            </w:pPr>
-            <w:r>
-              <w:t xml:space="preserve">1719</w:t>
-            </w:r>
-          </w:p>
-        </w:tc>
-        <w:tc>
-          <w:tcPr/>
-          <w:p>
-            <w:pPr>
-              <w:numPr>
-                <w:ilvl w:val="0"/>
-                <w:numId w:val="1000"/>
-              </w:numPr>
-              <w:pStyle w:val="Compact"/>
-              <w:jc w:val="center"/>
-            </w:pPr>
-            <w:r>
-              <w:t xml:space="preserve">59</w:t>
             </w:r>
           </w:p>
         </w:tc>

</xml_diff>